<commit_message>
Publish committee memo and final submission files
</commit_message>
<xml_diff>
--- a/Final Submission/Committee Memo.docx
+++ b/Final Submission/Committee Memo.docx
@@ -593,7 +593,7 @@
     </w:p>
     <w:p>
       <w:r>
-        <w:t>In a simultaneous illustrative equity fall of 25% and 100 basis point increase in bond yields, the starting fund loses about 14.42% under principal matching and about 15.08% under coupon funding. The 12% warning and 15% review rules set by the trustees apply to a rolling, withdrawal-adjusted fund return, not to this one-time stress scenario. It would be incorrect to state that the simulated 15.08% figure proves a rule was breached.</w:t>
+        <w:t>In a simultaneous illustrative equity fall of 25% and 100 basis point increase in bond yields, the starting fund loses about 14.42% under principal matching and about 15.08% under coupon funding. We propose a 12% early warning and a 15% escalation based on rolling, withdrawal-adjusted fund returns. The trustees have not approved these precise thresholds or the measurement period; they are our response to the board's stated discomfort with losses near 15%, not established trustee rules. It would be incorrect to state that the simulated 15.08% figure proves a rule was breached.</w:t>
       </w:r>
     </w:p>
     <w:p>
@@ -621,7 +621,7 @@
     </w:p>
     <w:p>
       <w:r>
-        <w:t>After the original policy was fixed, the team obtained the daily Yahoo price series covering the later evaluation window and saved the raw responses, versions and hashes. The eight-stock portfolio and a VTI-only alternative were both charged the same initial 10 basis point entry fee. The observed equity valuation uses the 3 January 2023 closing-price proxy, keeps share quantities fixed and permits the weights to drift. It covers 752 common trading dates and 36 month-end observations.</w:t>
+        <w:t>After the original policy was fixed, the team obtained the daily Yahoo price series covering the later evaluation window and saved the raw responses, versions and hashes. The eight-stock portfolio and a VTI-only alternative were both charged the same initial 10 basis point entry fee. This evaluation starts from the original policy's USD 6.229 million growth allocation, not the revised principal-matching allocation of USD 6.210 million shown elsewhere. The observed equity valuation uses the 3 January 2023 closing-price proxy, keeps share quantities fixed and permits the weights to drift. It covers 752 common trading dates and 36 month-end observations.</w:t>
       </w:r>
     </w:p>
     <w:tbl>
@@ -831,7 +831,7 @@
     </w:p>
     <w:p>
       <w:r>
-        <w:t>The fund monitor distinguishes between observed stock prices and modeled bond valuations. It adds back a mandatory distribution in the month of payment when computing a time-weighted return. A 12% rolling loss is a warning to review liquidity and forecast assumptions; a 15% rolling loss prompts the stronger review required by the trustee rules. Neither action changes the payment obligations or licenses use of future price information in a 2022 decision.</w:t>
+        <w:t>The fund monitor distinguishes between observed stock prices and modeled bond valuations. It adds back a mandatory distribution in the month of payment when computing a time-weighted return. Under our proposed monitoring policy, a 12% rolling loss would prompt an early review of liquidity and forecasts, while a 15% rolling loss would trigger a deeper trustee discussion, subject to board approval. Neither action changes the payment obligations or licenses use of future price information in a 2022 decision.</w:t>
       </w:r>
     </w:p>
     <w:p>
@@ -864,7 +864,7 @@
     </w:p>
     <w:p>
       <w:r>
-        <w:t>[2] Kappa initial decision record and original 22 October 2026 policy archive, preserved separately.</w:t>
+        <w:t>[2] Kappa initial decision record and preserved 2022 policy evidence. The exact emailed 22 October ZIP has not been independently authenticated in this repository.</w:t>
       </w:r>
     </w:p>
     <w:p>

</xml_diff>